<commit_message>
Forensic revision v3.1.0 for TS-01/TS-03/TS-05/TS-07 (final four): outbox SQL columns, classification-board probe route, ulms_db name, HikariCP pool reconciliation + LaTeX repair, ulms schema prefix, HMAC-before-200 webhook step, loan row-lock semantics; addenda + revision rows; md twins synced
</commit_message>
<xml_diff>
--- a/technical_document/docx/02_troubleshooting/DOC-02-TS-01_SRE_Incident_Response_and_Diagnostic_Decision_Trees.docx
+++ b/technical_document/docx/02_troubleshooting/DOC-02-TS-01_SRE_Incident_Response_and_Diagnostic_Decision_Trees.docx
@@ -1580,6 +1580,58 @@
                 <w:sz w:val="17"/>
               </w:rPr>
               <w:t>Master Approved</w:t>
+            </w:r>
+          </w:p>
+        </w:tc>
+      </w:tr>
+      <w:tr>
+        <w:tc>
+          <w:tcPr>
+            <w:tcW w:type="dxa" w:w="1872"/>
+          </w:tcPr>
+          <w:p>
+            <w:r>
+              <w:t>3.1.0</w:t>
+            </w:r>
+          </w:p>
+        </w:tc>
+        <w:tc>
+          <w:tcPr>
+            <w:tcW w:type="dxa" w:w="1872"/>
+          </w:tcPr>
+          <w:p>
+            <w:r>
+              <w:t>October 2026</w:t>
+            </w:r>
+          </w:p>
+        </w:tc>
+        <w:tc>
+          <w:tcPr>
+            <w:tcW w:type="dxa" w:w="1872"/>
+          </w:tcPr>
+          <w:p>
+            <w:r>
+              <w:t>Independent Forensic Re-audit</w:t>
+            </w:r>
+          </w:p>
+        </w:tc>
+        <w:tc>
+          <w:tcPr>
+            <w:tcW w:type="dxa" w:w="1872"/>
+          </w:tcPr>
+          <w:p>
+            <w:r>
+              <w:t>Factual corrections per audit/docx_forensic_audit_2026-10-08.md</w:t>
+            </w:r>
+          </w:p>
+        </w:tc>
+        <w:tc>
+          <w:tcPr>
+            <w:tcW w:type="dxa" w:w="1872"/>
+          </w:tcPr>
+          <w:p>
+            <w:r>
+              <w:t>Applied</w:t>
             </w:r>
           </w:p>
         </w:tc>
@@ -4254,11 +4306,11 @@
               </w:rPr>
               <w:t xml:space="preserve">   docker compose exec -T postgres psql -U ulms -d ulms -c \</w:t>
               <w:br/>
-              <w:t xml:space="preserve">     "SELECT id, aggregate_type, aggregate_id, error_detail </w:t>
+              <w:t xml:space="preserve">     "SELECT id, aggregate, aggregate_id, attempts </w:t>
               <w:br/>
               <w:t xml:space="preserve">      FROM ulms.outbox_event </w:t>
               <w:br/>
-              <w:t xml:space="preserve">      WHERE dispatched_at IS NULL AND retry_count &gt;= 5 LIMIT 5;"</w:t>
+              <w:t xml:space="preserve">      WHERE dispatched_at IS NULL AND attempts &gt;= 5 LIMIT 5;"</w:t>
             </w:r>
           </w:p>
         </w:tc>
@@ -4344,7 +4396,7 @@
               <w:br/>
               <w:t xml:space="preserve">     "UPDATE ulms.outbox_event </w:t>
               <w:br/>
-              <w:t xml:space="preserve">      SET dispatched_at = now(), status = 'DEAD_LETTER' </w:t>
+              <w:t xml:space="preserve">      SET dispatched_at = now()  -- no status column; dead-letter = manual triage via attempts </w:t>
               <w:br/>
               <w:t xml:space="preserve">      WHERE id = '&lt;STUCK_EVENT_ID&gt;';"</w:t>
             </w:r>
@@ -4635,6 +4687,19 @@
           <w:sz w:val="19"/>
         </w:rPr>
         <w:t>— End of SRE Incident Runbook —</w:t>
+      </w:r>
+    </w:p>
+    <w:p>
+      <w:r>
+        <w:rPr>
+          <w:b/>
+        </w:rPr>
+        <w:t>Addendum — v3.1.0 corrections (Independent Forensic Re-audit, 8 October 2026)</w:t>
+      </w:r>
+    </w:p>
+    <w:p>
+      <w:r>
+        <w:t>Corrections (v3.1.0): the health probe now targets the real route /api/v1/compliance/classification/board; outbox triage SQL aligned to the actual ulms.outbox_event columns (aggregate, attempts — there are no error_detail/status/retry_count columns; created_at and dispatched_at are real and used above).</w:t>
       </w:r>
     </w:p>
     <w:sectPr>

</xml_diff>